<commit_message>
feat: add lista 00
</commit_message>
<xml_diff>
--- a/lista/lista_t/00/00.mc_lista_ex_t.docx
+++ b/lista/lista_t/00/00.mc_lista_ex_t.docx
@@ -202,29 +202,7 @@
           <w:sz w:val="36"/>
           <w:szCs w:val="36"/>
         </w:rPr>
-        <w:t xml:space="preserve">Provocação: Se o computador é uma máquina exata, por que somar 0.1 + 0.2 em </w:t>
-      </w:r>
-      <w:proofErr w:type="spellStart"/>
-      <w:r>
-        <w:rPr>
-          <w:rFonts w:ascii="Roboto" w:hAnsi="Roboto"/>
-          <w:i/>
-          <w:iCs/>
-          <w:sz w:val="36"/>
-          <w:szCs w:val="36"/>
-        </w:rPr>
-        <w:t>JavaScript</w:t>
-      </w:r>
-      <w:proofErr w:type="spellEnd"/>
-      <w:r>
-        <w:rPr>
-          <w:rFonts w:ascii="Roboto" w:hAnsi="Roboto"/>
-          <w:i/>
-          <w:iCs/>
-          <w:sz w:val="36"/>
-          <w:szCs w:val="36"/>
-        </w:rPr>
-        <w:t xml:space="preserve"> ou Python pode dar 0.30000000000000004? Isso importa no mundo real?</w:t>
+        <w:t>Provocação: Se o computador é uma máquina exata, por que somar 0.1 + 0.2 em JavaScript ou Python pode dar 0.30000000000000004? Isso importa no mundo real?</w:t>
       </w:r>
     </w:p>
     <w:p>
@@ -520,25 +498,7 @@
           <w:sz w:val="36"/>
           <w:szCs w:val="36"/>
         </w:rPr>
-        <w:t xml:space="preserve"> Na era da ciência de dados e da inteligência artificial, o desenvolvedor precisa parar de pensar apenas em "verdadeiro ou falso" e começar a pensar em distribuições de probabilidade, média, desvio padrão e teorema de </w:t>
-      </w:r>
-      <w:proofErr w:type="spellStart"/>
-      <w:r>
-        <w:rPr>
-          <w:rFonts w:ascii="Roboto" w:hAnsi="Roboto"/>
-          <w:sz w:val="36"/>
-          <w:szCs w:val="36"/>
-        </w:rPr>
-        <w:t>Bayes</w:t>
-      </w:r>
-      <w:proofErr w:type="spellEnd"/>
-      <w:r>
-        <w:rPr>
-          <w:rFonts w:ascii="Roboto" w:hAnsi="Roboto"/>
-          <w:sz w:val="36"/>
-          <w:szCs w:val="36"/>
-        </w:rPr>
-        <w:t xml:space="preserve">. Explique como esses conceitos matemáticos ajudam a avaliar se um software ou </w:t>
+        <w:t xml:space="preserve"> Na era da ciência de dados e da inteligência artificial, o desenvolvedor precisa parar de pensar apenas em "verdadeiro ou falso" e começar a pensar em distribuições de probabilidade, média, desvio padrão e teorema de Bayes. Explique como esses conceitos matemáticos ajudam a avaliar se um software ou </w:t>
       </w:r>
       <w:r>
         <w:rPr>
@@ -734,6 +694,24 @@
           <w:szCs w:val="36"/>
         </w:rPr>
       </w:pPr>
+    </w:p>
+    <w:p>
+      <w:pPr>
+        <w:pStyle w:val="Default"/>
+        <w:rPr>
+          <w:rFonts w:ascii="Roboto" w:hAnsi="Roboto"/>
+          <w:sz w:val="36"/>
+          <w:szCs w:val="36"/>
+        </w:rPr>
+      </w:pPr>
+      <w:r>
+        <w:rPr>
+          <w:rFonts w:ascii="Roboto" w:hAnsi="Roboto"/>
+          <w:sz w:val="36"/>
+          <w:szCs w:val="36"/>
+        </w:rPr>
+        <w:t>6. Na sua opinião, e em uma frase, justifique porque você deve estudar Matemática Computacional.</w:t>
+      </w:r>
     </w:p>
     <w:sectPr>
       <w:headerReference w:type="default" r:id="rId7"/>
@@ -3410,6 +3388,7 @@
   <w:style w:type="character" w:default="1" w:styleId="Fontepargpadro">
     <w:name w:val="Default Paragraph Font"/>
     <w:uiPriority w:val="1"/>
+    <w:semiHidden/>
     <w:unhideWhenUsed/>
   </w:style>
   <w:style w:type="table" w:default="1" w:styleId="Tabelanormal">

</xml_diff>